<commit_message>
Update Overview manual with NER and sentiment analysis notes
</commit_message>
<xml_diff>
--- a/manual/03_Overview.docx
+++ b/manual/03_Overview.docx
@@ -188,7 +188,7 @@
         <w:pStyle w:val="Heading2"/>
       </w:pPr>
       <w:r>
-        <w:t>3. Sentiment and Topic Analysis</w:t>
+        <w:t>3. Sentiment, Topic Analysis, and NER</w:t>
       </w:r>
     </w:p>
     <w:p>
@@ -218,7 +218,114 @@
         <w:t>Sentiment Analysis:</w:t>
       </w:r>
       <w:r>
-        <w:t xml:space="preserve"> Choose TF/IDF or BERTopic &gt; configure Sentiment &gt; run labelling.</w:t>
+        <w:t xml:space="preserve"> (Note: Only works for English corpus)</w:t>
+      </w:r>
+    </w:p>
+    <w:p>
+      <w:pPr>
+        <w:pStyle w:val="ListBullet2"/>
+      </w:pPr>
+      <w:r>
+        <w:t>Choose TF/IDF or BERTopic &gt; configure Sentiment &gt; run labelling.</w:t>
+      </w:r>
+    </w:p>
+    <w:p>
+      <w:pPr>
+        <w:pStyle w:val="ListBullet2"/>
+      </w:pPr>
+      <w:r/>
+      <w:r>
+        <w:rPr>
+          <w:b/>
+        </w:rPr>
+        <w:t>Note:</w:t>
+      </w:r>
+      <w:r>
+        <w:t xml:space="preserve"> Check the Sub-corpus Stats to see the XML changes after running!</w:t>
+      </w:r>
+    </w:p>
+    <w:p>
+      <w:pPr>
+        <w:pStyle w:val="ListBullet2"/>
+      </w:pPr>
+      <w:r/>
+      <w:r>
+        <w:rPr>
+          <w:b/>
+        </w:rPr>
+        <w:t>NER (Named Entity Recognition):</w:t>
+      </w:r>
+      <w:r>
+        <w:t xml:space="preserve"> (Note: Only works for English corpus)</w:t>
+      </w:r>
+    </w:p>
+    <w:p>
+      <w:pPr>
+        <w:pStyle w:val="ListBullet2"/>
+      </w:pPr>
+      <w:r/>
+      <w:r>
+        <w:rPr>
+          <w:b/>
+        </w:rPr>
+        <w:t>Entity Classification:</w:t>
+      </w:r>
+      <w:r>
+        <w:t xml:space="preserve"> Automatically extracts and labels proper nouns into categories (e.g., Person, Organization, Location, Date).</w:t>
+      </w:r>
+    </w:p>
+    <w:p>
+      <w:pPr>
+        <w:pStyle w:val="ListBullet2"/>
+      </w:pPr>
+      <w:r/>
+      <w:r>
+        <w:rPr>
+          <w:b/>
+        </w:rPr>
+        <w:t>NER extraction method:</w:t>
+      </w:r>
+      <w:r>
+        <w:t xml:space="preserve"> Choose between Dependency-based or Regex (you need to write the regex manually).</w:t>
+      </w:r>
+    </w:p>
+    <w:p>
+      <w:pPr>
+        <w:pStyle w:val="ListBullet2"/>
+      </w:pPr>
+      <w:r/>
+      <w:r>
+        <w:rPr>
+          <w:b/>
+        </w:rPr>
+        <w:t>Spacy Pipeline model:</w:t>
+      </w:r>
+      <w:r>
+        <w:t xml:space="preserve"> Choose your preferred model.</w:t>
+      </w:r>
+    </w:p>
+    <w:p>
+      <w:pPr>
+        <w:pStyle w:val="ListBullet2"/>
+      </w:pPr>
+      <w:r/>
+      <w:r>
+        <w:rPr>
+          <w:b/>
+        </w:rPr>
+        <w:t>RUN:</w:t>
+      </w:r>
+      <w:r>
+        <w:t xml:space="preserve"> Annotates the corpus with XML tags. (</w:t>
+      </w:r>
+      <w:r>
+        <w:rPr>
+          <w:b/>
+        </w:rPr>
+        <w:t>Note:</w:t>
+      </w:r>
+      <w:r>
+        <w:t xml:space="preserve"> Check the Sub-corpus Stats to see the XML changes after running!)</w:t>
       </w:r>
     </w:p>
     <w:p>
@@ -233,7 +340,7 @@
         <w:t>Coming Later:</w:t>
       </w:r>
       <w:r>
-        <w:t xml:space="preserve"> NER, Lexical Complexity, Dependency Parsing, and Reading Ease.</w:t>
+        <w:t xml:space="preserve"> Lexical Complexity, Dependency Parsing, and Reading Ease.</w:t>
       </w:r>
     </w:p>
     <w:sectPr>

</xml_diff>

<commit_message>
Update Overview manual with Advanced NLP features
</commit_message>
<xml_diff>
--- a/manual/03_Overview.docx
+++ b/manual/03_Overview.docx
@@ -188,7 +188,7 @@
         <w:pStyle w:val="Heading2"/>
       </w:pPr>
       <w:r>
-        <w:t>3. Sentiment, Topic Analysis, and NER</w:t>
+        <w:t>3. Sentiment, Topic Analysis, and Advanced NLP</w:t>
       </w:r>
     </w:p>
     <w:p>
@@ -337,10 +337,175 @@
         <w:rPr>
           <w:b/>
         </w:rPr>
-        <w:t>Coming Later:</w:t>
+        <w:t>Dependency Parsing:</w:t>
       </w:r>
       <w:r>
-        <w:t xml:space="preserve"> Lexical Complexity, Dependency Parsing, and Reading Ease.</w:t>
+        <w:t xml:space="preserve"> (Note: Only works for English corpus)</w:t>
+      </w:r>
+    </w:p>
+    <w:p>
+      <w:pPr>
+        <w:pStyle w:val="ListBullet2"/>
+      </w:pPr>
+      <w:r>
+        <w:t>Annotate with dependency parsing (e.g., nsubj for noun subject, agent, relcl for relative clause).</w:t>
+      </w:r>
+    </w:p>
+    <w:p>
+      <w:pPr>
+        <w:pStyle w:val="ListBullet2"/>
+      </w:pPr>
+      <w:r/>
+      <w:r>
+        <w:rPr>
+          <w:b/>
+        </w:rPr>
+        <w:t>Spacy pipeline model:</w:t>
+      </w:r>
+      <w:r>
+        <w:t xml:space="preserve"> Choose your preferred model &gt; Run dependency parsing.</w:t>
+      </w:r>
+    </w:p>
+    <w:p>
+      <w:pPr>
+        <w:pStyle w:val="ListBullet"/>
+      </w:pPr>
+      <w:r/>
+      <w:r>
+        <w:rPr>
+          <w:b/>
+        </w:rPr>
+        <w:t>Reading Ease:</w:t>
+      </w:r>
+      <w:r/>
+    </w:p>
+    <w:p>
+      <w:pPr>
+        <w:pStyle w:val="ListBullet2"/>
+      </w:pPr>
+      <w:r>
+        <w:t>Evaluates texts using standard indexes (Flesch Reading Ease, Flesch-Kincaid Grade Level, LIX, RIX).</w:t>
+      </w:r>
+    </w:p>
+    <w:p>
+      <w:pPr>
+        <w:pStyle w:val="ListBullet2"/>
+      </w:pPr>
+      <w:r/>
+      <w:r>
+        <w:rPr>
+          <w:b/>
+        </w:rPr>
+        <w:t>Chunk Readability:</w:t>
+      </w:r>
+      <w:r>
+        <w:t xml:space="preserve"> Useful if 1 text has multiple difficulties segments.</w:t>
+      </w:r>
+    </w:p>
+    <w:p>
+      <w:pPr>
+        <w:pStyle w:val="ListBullet3"/>
+      </w:pPr>
+      <w:r/>
+      <w:r>
+        <w:rPr>
+          <w:b/>
+        </w:rPr>
+        <w:t>By segment:</w:t>
+      </w:r>
+      <w:r>
+        <w:t xml:space="preserve"> e.g., 10, 100, 1000.</w:t>
+      </w:r>
+    </w:p>
+    <w:p>
+      <w:pPr>
+        <w:pStyle w:val="ListBullet3"/>
+      </w:pPr>
+      <w:r/>
+      <w:r>
+        <w:rPr>
+          <w:b/>
+        </w:rPr>
+        <w:t>By subcorpora:</w:t>
+      </w:r>
+      <w:r>
+        <w:t xml:space="preserve"> Choose attributes from the radio button.</w:t>
+      </w:r>
+    </w:p>
+    <w:p>
+      <w:pPr>
+        <w:pStyle w:val="ListBullet2"/>
+      </w:pPr>
+      <w:r/>
+      <w:r>
+        <w:rPr>
+          <w:b/>
+        </w:rPr>
+        <w:t>Readability annotation:</w:t>
+      </w:r>
+      <w:r>
+        <w:t xml:space="preserve"> Annotate by sentence (if chosen, chunk will automatically be disabled) or by chunk &gt; annotate.</w:t>
+      </w:r>
+    </w:p>
+    <w:p>
+      <w:pPr>
+        <w:pStyle w:val="ListBullet"/>
+      </w:pPr>
+      <w:r/>
+      <w:r>
+        <w:rPr>
+          <w:b/>
+        </w:rPr>
+        <w:t>Lexical Complexity:</w:t>
+      </w:r>
+      <w:r>
+        <w:t xml:space="preserve"> (Generic works for all languages; Lu's LCA only for English corpus)</w:t>
+      </w:r>
+    </w:p>
+    <w:p>
+      <w:pPr>
+        <w:pStyle w:val="ListBullet2"/>
+      </w:pPr>
+      <w:r/>
+      <w:r>
+        <w:rPr>
+          <w:b/>
+        </w:rPr>
+        <w:t>Generic:</w:t>
+      </w:r>
+      <w:r>
+        <w:t xml:space="preserve"> Automatically computed.</w:t>
+      </w:r>
+    </w:p>
+    <w:p>
+      <w:pPr>
+        <w:pStyle w:val="ListBullet2"/>
+      </w:pPr>
+      <w:r/>
+      <w:r>
+        <w:rPr>
+          <w:b/>
+        </w:rPr>
+        <w:t>Lu's LCA:</w:t>
+      </w:r>
+      <w:r>
+        <w:t xml:space="preserve"> Choose wordlist (for lexical sophistication e.g., NGSL, AWL etc.) &gt; Choose analysis level.</w:t>
+      </w:r>
+    </w:p>
+    <w:p>
+      <w:pPr>
+        <w:pStyle w:val="ListBullet3"/>
+      </w:pPr>
+      <w:r>
+        <w:t>Default is by file.</w:t>
+      </w:r>
+    </w:p>
+    <w:p>
+      <w:pPr>
+        <w:pStyle w:val="ListBullet2"/>
+      </w:pPr>
+      <w:r>
+        <w:t>If by sub-corpus, choose sub-corpus then choose attribute (e.g., choosing sentiment will display 3 segments: positive, negative, and neutral complexity in the table).</w:t>
       </w:r>
     </w:p>
     <w:sectPr>

</xml_diff>

<commit_message>
Restructure Overview manual with flat numbering 1-11
</commit_message>
<xml_diff>
--- a/manual/03_Overview.docx
+++ b/manual/03_Overview.docx
@@ -11,8 +11,16 @@
       </w:r>
     </w:p>
     <w:p>
+      <w:pPr>
+        <w:pStyle w:val="Heading2"/>
+      </w:pPr>
       <w:r>
-        <w:t>Overview has multiple tabs whose functions can be divided into two main categories: Observation and Observation and Annotation.</w:t>
+        <w:t>1. XML STRUCTURE</w:t>
+      </w:r>
+    </w:p>
+    <w:p>
+      <w:r>
+        <w:t>See the structure of the corpus from XML annotations (if any). Useful for searching. (Note: XML structure will update if you choose to annotate).</w:t>
       </w:r>
     </w:p>
     <w:p>
@@ -20,87 +28,12 @@
         <w:pStyle w:val="Heading2"/>
       </w:pPr>
       <w:r>
-        <w:t>1. Observation</w:t>
+        <w:t>2. SUB-CORPUS STATS</w:t>
       </w:r>
     </w:p>
     <w:p>
       <w:r>
-        <w:t>These tabs allow you to view and explore the corpus data.</w:t>
-      </w:r>
-    </w:p>
-    <w:p>
-      <w:pPr>
-        <w:pStyle w:val="ListBullet"/>
-      </w:pPr>
-      <w:r/>
-      <w:r>
-        <w:rPr>
-          <w:b/>
-        </w:rPr>
-        <w:t>XML Structure:</w:t>
-      </w:r>
-      <w:r>
-        <w:t xml:space="preserve"> See the structure of the corpus from XML annotations (if any). Useful for searching.</w:t>
-      </w:r>
-    </w:p>
-    <w:p>
-      <w:pPr>
-        <w:pStyle w:val="ListBullet"/>
-      </w:pPr>
-      <w:r/>
-      <w:r>
-        <w:rPr>
-          <w:b/>
-        </w:rPr>
-        <w:t>Sub-corpus Stats:</w:t>
-      </w:r>
-      <w:r>
-        <w:t xml:space="preserve"> See the corpus structure in a chart and table. Useful for searching.</w:t>
-      </w:r>
-    </w:p>
-    <w:p>
-      <w:pPr>
-        <w:pStyle w:val="ListBullet"/>
-      </w:pPr>
-      <w:r/>
-      <w:r>
-        <w:rPr>
-          <w:b/>
-        </w:rPr>
-        <w:t>Frequency List:</w:t>
-      </w:r>
-      <w:r>
-        <w:t xml:space="preserve"> See the frequency list and download it.</w:t>
-      </w:r>
-    </w:p>
-    <w:p>
-      <w:pPr>
-        <w:pStyle w:val="ListBullet"/>
-      </w:pPr>
-      <w:r/>
-      <w:r>
-        <w:rPr>
-          <w:b/>
-        </w:rPr>
-        <w:t>Unique POS Tags:</w:t>
-      </w:r>
-      <w:r>
-        <w:t xml:space="preserve"> See all POS tags used in the corpus and their definitions (if any).</w:t>
-      </w:r>
-    </w:p>
-    <w:p>
-      <w:pPr>
-        <w:pStyle w:val="ListBullet"/>
-      </w:pPr>
-      <w:r/>
-      <w:r>
-        <w:rPr>
-          <w:b/>
-        </w:rPr>
-        <w:t>Wordcloud:</w:t>
-      </w:r>
-      <w:r>
-        <w:t xml:space="preserve"> See a word cloud generated from the corpus.</w:t>
+        <w:t>See the corpus structure in a chart and table. Useful for searching. (Note: Sub-corpus stats will update if you choose to annotate).</w:t>
       </w:r>
     </w:p>
     <w:p>
@@ -108,20 +41,46 @@
         <w:pStyle w:val="Heading2"/>
       </w:pPr>
       <w:r>
-        <w:t>2. Observation and Annotation</w:t>
+        <w:t>3. FREQUENCY LIST</w:t>
       </w:r>
     </w:p>
     <w:p>
       <w:r>
-        <w:t>These functions allow you to interact with and modify your corpus. (Note: XML structure and sub-corpus stats will update if you choose to annotate).</w:t>
+        <w:t>See the frequency list and download it.</w:t>
       </w:r>
     </w:p>
     <w:p>
       <w:pPr>
-        <w:pStyle w:val="Heading3"/>
+        <w:pStyle w:val="Heading2"/>
       </w:pPr>
       <w:r>
-        <w:t>Metadata Annotation</w:t>
+        <w:t>4. UNIQUE POS TAGS</w:t>
+      </w:r>
+    </w:p>
+    <w:p>
+      <w:r>
+        <w:t>See all POS tags used in the corpus and their definitions (if any).</w:t>
+      </w:r>
+    </w:p>
+    <w:p>
+      <w:pPr>
+        <w:pStyle w:val="Heading2"/>
+      </w:pPr>
+      <w:r>
+        <w:t>5. WORD CLOUD</w:t>
+      </w:r>
+    </w:p>
+    <w:p>
+      <w:r>
+        <w:t>See a word cloud generated from the corpus.</w:t>
+      </w:r>
+    </w:p>
+    <w:p>
+      <w:pPr>
+        <w:pStyle w:val="Heading2"/>
+      </w:pPr>
+      <w:r>
+        <w:t>6. METADATA ANNOTATION</w:t>
       </w:r>
     </w:p>
     <w:p>
@@ -188,7 +147,7 @@
         <w:pStyle w:val="Heading2"/>
       </w:pPr>
       <w:r>
-        <w:t>3. Sentiment, Topic Analysis, and Advanced NLP</w:t>
+        <w:t>7. SENTIMENT AND TOPIC ANALYSIS</w:t>
       </w:r>
     </w:p>
     <w:p>
@@ -246,17 +205,15 @@
     </w:p>
     <w:p>
       <w:pPr>
-        <w:pStyle w:val="ListBullet2"/>
+        <w:pStyle w:val="Heading2"/>
       </w:pPr>
-      <w:r/>
       <w:r>
-        <w:rPr>
-          <w:b/>
-        </w:rPr>
-        <w:t>NER (Named Entity Recognition):</w:t>
+        <w:t>8. NAMED ENTITY RECOGNITION</w:t>
       </w:r>
+    </w:p>
+    <w:p>
       <w:r>
-        <w:t xml:space="preserve"> (Note: Only works for English corpus)</w:t>
+        <w:t>(Note: Only works for English corpus)</w:t>
       </w:r>
     </w:p>
     <w:p>
@@ -330,17 +287,15 @@
     </w:p>
     <w:p>
       <w:pPr>
-        <w:pStyle w:val="ListBullet"/>
+        <w:pStyle w:val="Heading2"/>
       </w:pPr>
-      <w:r/>
       <w:r>
-        <w:rPr>
-          <w:b/>
-        </w:rPr>
-        <w:t>Dependency Parsing:</w:t>
+        <w:t>9. DEPENDENCY PARSING</w:t>
       </w:r>
+    </w:p>
+    <w:p>
       <w:r>
-        <w:t xml:space="preserve"> (Note: Only works for English corpus)</w:t>
+        <w:t>(Note: Only works for English corpus)</w:t>
       </w:r>
     </w:p>
     <w:p>
@@ -368,16 +323,11 @@
     </w:p>
     <w:p>
       <w:pPr>
-        <w:pStyle w:val="ListBullet"/>
+        <w:pStyle w:val="Heading2"/>
       </w:pPr>
-      <w:r/>
       <w:r>
-        <w:rPr>
-          <w:b/>
-        </w:rPr>
-        <w:t>Reading Ease:</w:t>
+        <w:t>10. READING EASE</w:t>
       </w:r>
-      <w:r/>
     </w:p>
     <w:p>
       <w:pPr>
@@ -449,17 +399,15 @@
     </w:p>
     <w:p>
       <w:pPr>
-        <w:pStyle w:val="ListBullet"/>
+        <w:pStyle w:val="Heading2"/>
       </w:pPr>
-      <w:r/>
       <w:r>
-        <w:rPr>
-          <w:b/>
-        </w:rPr>
-        <w:t>Lexical Complexity:</w:t>
+        <w:t>11. LEXICAL COMPLEXITY</w:t>
       </w:r>
+    </w:p>
+    <w:p>
       <w:r>
-        <w:t xml:space="preserve"> (Generic works for all languages; Lu's LCA only for English corpus)</w:t>
+        <w:t>(Generic works for all languages; Lu's LCA only for English corpus)</w:t>
       </w:r>
     </w:p>
     <w:p>

</xml_diff>